<commit_message>
Präteritum üben: Konjugation regelmäßig/unregelmäßig mit Endungen
Neue Phase 1: kämpfen und werfen im Präteritum per Kreide-Kette
konjugieren, Endungen einkreisen, Merkzeile ins Heft. Zeiten von Ü9a
und Ü9b auf je 8 Minuten angepasst.

Co-Authored-By: Claude Opus 5.5 <noreply@anthropic.com>
Claude-Session: https://claude.ai/code/session_01KXvLXHMYPnCyEbMRgNaaYs
</commit_message>
<xml_diff>
--- a/Deutsch_7A/Praeteritum_ueben_Plusquamperfekt/Tafelskript_Praeteritum_ueben_Plusquamperfekt.docx
+++ b/Deutsch_7A/Praeteritum_ueben_Plusquamperfekt/Tafelskript_Praeteritum_ueben_Plusquamperfekt.docx
@@ -471,7 +471,7 @@
                 <w:sz w:val="21"/>
                 <w:szCs w:val="21"/>
               </w:rPr>
-              <w:t xml:space="preserve">10′</w:t>
+              <w:t xml:space="preserve">6′</w:t>
             </w:r>
           </w:p>
         </w:tc>
@@ -505,7 +505,7 @@
                 <w:sz w:val="21"/>
                 <w:szCs w:val="21"/>
               </w:rPr>
-              <w:t xml:space="preserve">1 Ü9a Präteritum der Sportverben</w:t>
+              <w:t xml:space="preserve">1 Präteritum konjugieren</w:t>
             </w:r>
           </w:p>
         </w:tc>
@@ -539,7 +539,7 @@
                 <w:sz w:val="21"/>
                 <w:szCs w:val="21"/>
               </w:rPr>
-              <w:t xml:space="preserve">Schnipsel eintragen, Vergleich per Kreide-Kette</w:t>
+              <w:t xml:space="preserve">kämpfen (regelmäßig) und werfen (unregelmäßig) per Kreide-Kette ins Heft, Endungen markieren</w:t>
             </w:r>
           </w:p>
         </w:tc>
@@ -579,7 +579,7 @@
                 <w:sz w:val="21"/>
                 <w:szCs w:val="21"/>
               </w:rPr>
-              <w:t xml:space="preserve">10′</w:t>
+              <w:t xml:space="preserve">8′</w:t>
             </w:r>
           </w:p>
         </w:tc>
@@ -613,7 +613,7 @@
                 <w:sz w:val="21"/>
                 <w:szCs w:val="21"/>
               </w:rPr>
-              <w:t xml:space="preserve">2 Ü9b Bericht für die Vereinszeitung</w:t>
+              <w:t xml:space="preserve">2 Ü9a Präteritum der Sportverben</w:t>
             </w:r>
           </w:p>
         </w:tc>
@@ -647,7 +647,7 @@
                 <w:sz w:val="21"/>
                 <w:szCs w:val="21"/>
               </w:rPr>
-              <w:t xml:space="preserve">Lückentext im Präteritum, Vergleich per Kreide-Kette</w:t>
+              <w:t xml:space="preserve">Schnipsel eintragen, Vergleich per Kreide-Kette</w:t>
             </w:r>
           </w:p>
         </w:tc>
@@ -687,7 +687,7 @@
                 <w:sz w:val="21"/>
                 <w:szCs w:val="21"/>
               </w:rPr>
-              <w:t xml:space="preserve">12′</w:t>
+              <w:t xml:space="preserve">8′</w:t>
             </w:r>
           </w:p>
         </w:tc>
@@ -721,7 +721,7 @@
                 <w:sz w:val="21"/>
                 <w:szCs w:val="21"/>
               </w:rPr>
-              <w:t xml:space="preserve">3 Das Plusquamperfekt</w:t>
+              <w:t xml:space="preserve">3 Ü9b Bericht für die Vereinszeitung</w:t>
             </w:r>
           </w:p>
         </w:tc>
@@ -755,7 +755,7 @@
                 <w:sz w:val="21"/>
                 <w:szCs w:val="21"/>
               </w:rPr>
-              <w:t xml:space="preserve">Zeitstrahl, haben/sein im Präteritum (Heft), Merksatz 9</w:t>
+              <w:t xml:space="preserve">Lückentext im Präteritum, Vergleich per Kreide-Kette</w:t>
             </w:r>
           </w:p>
         </w:tc>
@@ -795,7 +795,7 @@
                 <w:sz w:val="21"/>
                 <w:szCs w:val="21"/>
               </w:rPr>
-              <w:t xml:space="preserve">8′</w:t>
+              <w:t xml:space="preserve">12′</w:t>
             </w:r>
           </w:p>
         </w:tc>
@@ -829,7 +829,7 @@
                 <w:sz w:val="21"/>
                 <w:szCs w:val="21"/>
               </w:rPr>
-              <w:t xml:space="preserve">4 Ü10 Was war vorher?</w:t>
+              <w:t xml:space="preserve">4 Das Plusquamperfekt</w:t>
             </w:r>
           </w:p>
         </w:tc>
@@ -863,7 +863,7 @@
                 <w:sz w:val="21"/>
                 <w:szCs w:val="21"/>
               </w:rPr>
-              <w:t xml:space="preserve">Schnipsel eintragen, Vergleich per Kreide-Kette</w:t>
+              <w:t xml:space="preserve">Zeitstrahl, haben/sein im Präteritum (Heft), Merksatz 9</w:t>
             </w:r>
           </w:p>
         </w:tc>
@@ -903,7 +903,7 @@
                 <w:sz w:val="21"/>
                 <w:szCs w:val="21"/>
               </w:rPr>
-              <w:t xml:space="preserve">(2′)</w:t>
+              <w:t xml:space="preserve">8′</w:t>
             </w:r>
           </w:p>
         </w:tc>
@@ -937,7 +937,115 @@
                 <w:sz w:val="21"/>
                 <w:szCs w:val="21"/>
               </w:rPr>
-              <w:t xml:space="preserve">5 optional</w:t>
+              <w:t xml:space="preserve">5 Ü10 Was war vorher?</w:t>
+            </w:r>
+          </w:p>
+        </w:tc>
+        <w:tc>
+          <w:tcPr>
+            <w:tcW w:type="dxa" w:w="5806"/>
+            <w:tcBorders>
+              <w:top w:val="single" w:color="B9C6E8" w:sz="6"/>
+              <w:left w:val="single" w:color="B9C6E8" w:sz="6"/>
+              <w:bottom w:val="single" w:color="B9C6E8" w:sz="6"/>
+              <w:right w:val="single" w:color="B9C6E8" w:sz="6"/>
+            </w:tcBorders>
+            <w:tcMar>
+              <w:top w:type="dxa" w:w="60"/>
+              <w:left w:type="dxa" w:w="100"/>
+              <w:bottom w:type="dxa" w:w="60"/>
+              <w:right w:type="dxa" w:w="100"/>
+            </w:tcMar>
+            <w:vAlign w:val="center"/>
+          </w:tcPr>
+          <w:p>
+            <w:pPr>
+              <w:spacing w:after="0" w:before="0"/>
+            </w:pPr>
+            <w:r>
+              <w:rPr>
+                <w:rFonts w:ascii="Calibri" w:cs="Calibri" w:eastAsia="Calibri" w:hAnsi="Calibri"/>
+                <w:b w:val="false"/>
+                <w:bCs w:val="false"/>
+                <w:color w:val="000000"/>
+                <w:sz w:val="21"/>
+                <w:szCs w:val="21"/>
+              </w:rPr>
+              <w:t xml:space="preserve">Schnipsel eintragen, Vergleich per Kreide-Kette</w:t>
+            </w:r>
+          </w:p>
+        </w:tc>
+      </w:tr>
+      <w:tr>
+        <w:trPr>
+          <w:cantSplit/>
+          <w:trHeight w:val="360" w:hRule="atLeast"/>
+        </w:trPr>
+        <w:tc>
+          <w:tcPr>
+            <w:tcW w:type="dxa" w:w="900"/>
+            <w:tcBorders>
+              <w:top w:val="single" w:color="B9C6E8" w:sz="6"/>
+              <w:left w:val="single" w:color="B9C6E8" w:sz="6"/>
+              <w:bottom w:val="single" w:color="B9C6E8" w:sz="6"/>
+              <w:right w:val="single" w:color="B9C6E8" w:sz="6"/>
+            </w:tcBorders>
+            <w:tcMar>
+              <w:top w:type="dxa" w:w="60"/>
+              <w:left w:type="dxa" w:w="100"/>
+              <w:bottom w:type="dxa" w:w="60"/>
+              <w:right w:type="dxa" w:w="100"/>
+            </w:tcMar>
+            <w:vAlign w:val="center"/>
+          </w:tcPr>
+          <w:p>
+            <w:pPr>
+              <w:spacing w:after="0" w:before="0"/>
+            </w:pPr>
+            <w:r>
+              <w:rPr>
+                <w:rFonts w:ascii="Calibri" w:cs="Calibri" w:eastAsia="Calibri" w:hAnsi="Calibri"/>
+                <w:b/>
+                <w:bCs/>
+                <w:color w:val="D9534F"/>
+                <w:sz w:val="21"/>
+                <w:szCs w:val="21"/>
+              </w:rPr>
+              <w:t xml:space="preserve">(2′)</w:t>
+            </w:r>
+          </w:p>
+        </w:tc>
+        <w:tc>
+          <w:tcPr>
+            <w:tcW w:type="dxa" w:w="3500"/>
+            <w:tcBorders>
+              <w:top w:val="single" w:color="B9C6E8" w:sz="6"/>
+              <w:left w:val="single" w:color="B9C6E8" w:sz="6"/>
+              <w:bottom w:val="single" w:color="B9C6E8" w:sz="6"/>
+              <w:right w:val="single" w:color="B9C6E8" w:sz="6"/>
+            </w:tcBorders>
+            <w:tcMar>
+              <w:top w:type="dxa" w:w="60"/>
+              <w:left w:type="dxa" w:w="100"/>
+              <w:bottom w:type="dxa" w:w="60"/>
+              <w:right w:type="dxa" w:w="100"/>
+            </w:tcMar>
+            <w:vAlign w:val="center"/>
+          </w:tcPr>
+          <w:p>
+            <w:pPr>
+              <w:spacing w:after="0" w:before="0"/>
+            </w:pPr>
+            <w:r>
+              <w:rPr>
+                <w:rFonts w:ascii="Calibri" w:cs="Calibri" w:eastAsia="Calibri" w:hAnsi="Calibri"/>
+                <w:b/>
+                <w:bCs/>
+                <w:color w:val="1E2761"/>
+                <w:sz w:val="21"/>
+                <w:szCs w:val="21"/>
+              </w:rPr>
+              <w:t xml:space="preserve">6 optional</w:t>
             </w:r>
           </w:p>
         </w:tc>
@@ -999,7 +1107,7 @@
           <w:sz w:val="21"/>
           <w:szCs w:val="21"/>
         </w:rPr>
-        <w:t xml:space="preserve">Wird es knapp, Ü10 nur bis Nr. 3 vergleichen und den Rest als Hausaufgabe geben. Phase 3 (Merksatz 9) darf nicht wegfallen.</w:t>
+        <w:t xml:space="preserve">Die 45 Minuten sind voll verplant. Wird es knapp, Ü10 nur bis Nr. 3 vergleichen und den Rest als Hausaufgabe geben. Phase 3 (Merksatz 9) darf nicht wegfallen.</w:t>
       </w:r>
     </w:p>
     <w:p>
@@ -1104,6 +1212,79 @@
                 <w:szCs w:val="20"/>
               </w:rPr>
               <w:t xml:space="preserve">Präteritum üben, Plusquamperfekt · Datum rechts</w:t>
+            </w:r>
+          </w:p>
+        </w:tc>
+      </w:tr>
+      <w:tr>
+        <w:trPr>
+          <w:cantSplit/>
+          <w:trHeight w:val="340" w:hRule="atLeast"/>
+        </w:trPr>
+        <w:tc>
+          <w:tcPr>
+            <w:tcW w:type="dxa" w:w="2300"/>
+            <w:tcBorders>
+              <w:top w:val="single" w:color="B9C6E8" w:sz="6"/>
+              <w:left w:val="single" w:color="B9C6E8" w:sz="6"/>
+              <w:bottom w:val="single" w:color="B9C6E8" w:sz="6"/>
+              <w:right w:val="single" w:color="B9C6E8" w:sz="6"/>
+            </w:tcBorders>
+            <w:shd w:fill="F4F7FD" w:color="auto" w:val="clear"/>
+            <w:tcMar>
+              <w:top w:type="dxa" w:w="60"/>
+              <w:left w:type="dxa" w:w="100"/>
+              <w:bottom w:type="dxa" w:w="60"/>
+              <w:right w:type="dxa" w:w="100"/>
+            </w:tcMar>
+            <w:vAlign w:val="center"/>
+          </w:tcPr>
+          <w:p>
+            <w:pPr>
+              <w:spacing w:after="0" w:before="0"/>
+            </w:pPr>
+            <w:r>
+              <w:rPr>
+                <w:rFonts w:ascii="Calibri" w:cs="Calibri" w:eastAsia="Calibri" w:hAnsi="Calibri"/>
+                <w:b/>
+                <w:bCs/>
+                <w:color w:val="1E2761"/>
+                <w:sz w:val="20"/>
+                <w:szCs w:val="20"/>
+              </w:rPr>
+              <w:t xml:space="preserve">Tabelle</w:t>
+            </w:r>
+          </w:p>
+        </w:tc>
+        <w:tc>
+          <w:tcPr>
+            <w:tcW w:type="dxa" w:w="7906"/>
+            <w:tcBorders>
+              <w:top w:val="single" w:color="B9C6E8" w:sz="6"/>
+              <w:left w:val="single" w:color="B9C6E8" w:sz="6"/>
+              <w:bottom w:val="single" w:color="B9C6E8" w:sz="6"/>
+              <w:right w:val="single" w:color="B9C6E8" w:sz="6"/>
+            </w:tcBorders>
+            <w:tcMar>
+              <w:top w:type="dxa" w:w="60"/>
+              <w:left w:type="dxa" w:w="100"/>
+              <w:bottom w:type="dxa" w:w="60"/>
+              <w:right w:type="dxa" w:w="100"/>
+            </w:tcMar>
+            <w:vAlign w:val="center"/>
+          </w:tcPr>
+          <w:p>
+            <w:pPr>
+              <w:spacing w:after="0" w:before="0"/>
+            </w:pPr>
+            <w:r>
+              <w:rPr>
+                <w:rFonts w:ascii="Calibri" w:cs="Calibri" w:eastAsia="Calibri" w:hAnsi="Calibri"/>
+                <w:color w:val="000000"/>
+                <w:sz w:val="20"/>
+                <w:szCs w:val="20"/>
+              </w:rPr>
+              <w:t xml:space="preserve">Präteritum konjugieren: kämpfen | werfen, Endungen markiert</w:t>
             </w:r>
           </w:p>
         </w:tc>
@@ -1746,6 +1927,1343 @@
           <w:sz w:val="28"/>
           <w:szCs w:val="28"/>
         </w:rPr>
+        <w:t xml:space="preserve">Präteritum konjugieren: regelmäßig und unregelmäßig</w:t>
+      </w:r>
+      <w:r>
+        <w:rPr>
+          <w:rFonts w:ascii="Calibri" w:cs="Calibri" w:eastAsia="Calibri" w:hAnsi="Calibri"/>
+          <w:b/>
+          <w:bCs/>
+          <w:color w:val="C77C12"/>
+          <w:sz w:val="20"/>
+          <w:szCs w:val="20"/>
+        </w:rPr>
+        <w:t xml:space="preserve">   6 Min.</w:t>
+      </w:r>
+    </w:p>
+    <w:tbl>
+      <w:tblPr>
+        <w:tblW w:type="dxa" w:w="10206"/>
+        <w:tblBorders>
+          <w:top w:val="single" w:color="auto" w:sz="4"/>
+          <w:left w:val="single" w:color="auto" w:sz="4"/>
+          <w:bottom w:val="single" w:color="auto" w:sz="4"/>
+          <w:right w:val="single" w:color="auto" w:sz="4"/>
+          <w:insideH w:val="single" w:color="auto" w:sz="4"/>
+          <w:insideV w:val="single" w:color="auto" w:sz="4"/>
+        </w:tblBorders>
+      </w:tblPr>
+      <w:tblGrid>
+        <w:gridCol w:w="1700"/>
+        <w:gridCol w:w="8506"/>
+      </w:tblGrid>
+      <w:tr>
+        <w:trPr>
+          <w:cantSplit/>
+        </w:trPr>
+        <w:tc>
+          <w:tcPr>
+            <w:tcW w:type="dxa" w:w="1700"/>
+            <w:tcBorders>
+              <w:top w:val="single" w:color="D5DDEE" w:sz="6"/>
+              <w:left w:val="single" w:color="D5DDEE" w:sz="6"/>
+              <w:bottom w:val="single" w:color="D5DDEE" w:sz="6"/>
+              <w:right w:val="single" w:color="D5DDEE" w:sz="6"/>
+            </w:tcBorders>
+            <w:shd w:fill="F4F7FD" w:color="auto" w:val="clear"/>
+            <w:tcMar>
+              <w:top w:type="dxa" w:w="100"/>
+              <w:left w:type="dxa" w:w="100"/>
+              <w:bottom w:type="dxa" w:w="100"/>
+              <w:right w:type="dxa" w:w="100"/>
+            </w:tcMar>
+            <w:vAlign w:val="top"/>
+          </w:tcPr>
+          <w:p>
+            <w:pPr>
+              <w:spacing w:after="10" w:before="0"/>
+            </w:pPr>
+            <w:r>
+              <w:rPr>
+                <w:rFonts w:ascii="Calibri" w:cs="Calibri" w:eastAsia="Calibri" w:hAnsi="Calibri"/>
+                <w:color w:val="5B6B8C"/>
+                <w:sz w:val="16"/>
+                <w:szCs w:val="16"/>
+              </w:rPr>
+              <w:t xml:space="preserve">Klasse</w:t>
+            </w:r>
+          </w:p>
+          <w:p>
+            <w:pPr>
+              <w:spacing w:after="0" w:before="0"/>
+            </w:pPr>
+            <w:r>
+              <w:rPr>
+                <w:rFonts w:ascii="Calibri" w:cs="Calibri" w:eastAsia="Calibri" w:hAnsi="Calibri"/>
+                <w:b/>
+                <w:bCs/>
+                <w:color w:val="1E2761"/>
+                <w:sz w:val="20"/>
+                <w:szCs w:val="20"/>
+              </w:rPr>
+              <w:t xml:space="preserve">kommt an die Tafel</w:t>
+            </w:r>
+          </w:p>
+        </w:tc>
+        <w:tc>
+          <w:tcPr>
+            <w:tcW w:type="dxa" w:w="8506"/>
+            <w:tcBorders>
+              <w:top w:val="single" w:color="D5DDEE" w:sz="6"/>
+              <w:left w:val="single" w:color="D5DDEE" w:sz="6"/>
+              <w:bottom w:val="single" w:color="D5DDEE" w:sz="6"/>
+              <w:right w:val="single" w:color="D5DDEE" w:sz="6"/>
+            </w:tcBorders>
+            <w:tcMar>
+              <w:top w:type="dxa" w:w="100"/>
+              <w:left w:type="dxa" w:w="160"/>
+              <w:bottom w:type="dxa" w:w="100"/>
+              <w:right w:type="dxa" w:w="100"/>
+            </w:tcMar>
+            <w:vAlign w:val="top"/>
+          </w:tcPr>
+          <w:p>
+            <w:pPr>
+              <w:spacing w:after="60" w:before="0"/>
+            </w:pPr>
+            <w:r>
+              <w:rPr>
+                <w:rFonts w:ascii="Calibri" w:cs="Calibri" w:eastAsia="Calibri" w:hAnsi="Calibri"/>
+                <w:b/>
+                <w:bCs/>
+                <w:color w:val="D9534F"/>
+                <w:sz w:val="20"/>
+                <w:szCs w:val="20"/>
+              </w:rPr>
+              <w:t xml:space="preserve">Ansage: </w:t>
+            </w:r>
+            <w:r>
+              <w:rPr>
+                <w:rFonts w:ascii="Calibri" w:cs="Calibri" w:eastAsia="Calibri" w:hAnsi="Calibri"/>
+                <w:i/>
+                <w:iCs/>
+                <w:color w:val="000000"/>
+                <w:sz w:val="21"/>
+                <w:szCs w:val="21"/>
+              </w:rPr>
+              <w:t xml:space="preserve">„Kreide-Kette: Wir konjugieren zwei Sportverben im Präteritum – kämpfen und werfen. Wer die Kreide hat, trägt eine Form ein und kreist die Endung ein. Alle anderen schreiben die Tabelle ins Heft und markieren mit.“</w:t>
+            </w:r>
+          </w:p>
+          <w:p>
+            <w:pPr>
+              <w:spacing w:after="50" w:before="0"/>
+            </w:pPr>
+            <w:r>
+              <w:rPr>
+                <w:rFonts w:ascii="Calibri" w:cs="Calibri" w:eastAsia="Calibri" w:hAnsi="Calibri"/>
+                <w:color w:val="000000"/>
+                <w:sz w:val="21"/>
+                <w:szCs w:val="21"/>
+              </w:rPr>
+              <w:t xml:space="preserve">Die Personen, die beiden Infinitive und „regelmäßig / unregelmäßig“ vorher anschreiben – die Formen trägt die Kreide-Kette ein.</w:t>
+            </w:r>
+          </w:p>
+          <w:p>
+            <w:pPr>
+              <w:spacing w:after="50" w:before="0"/>
+            </w:pPr>
+            <w:r>
+              <w:rPr>
+                <w:rFonts w:ascii="Calibri" w:cs="Calibri" w:eastAsia="Calibri" w:hAnsi="Calibri"/>
+                <w:color w:val="000000"/>
+                <w:sz w:val="21"/>
+                <w:szCs w:val="21"/>
+              </w:rPr>
+              <w:t xml:space="preserve">Endungen einkreisen lassen – mit Kreide/Bleistift, nicht in Rot (Rot bleibt für Hilfsverben). Bei werfen für ich und er/sie/es einen Strich setzen: Hier gibt es keine Endung.</w:t>
+            </w:r>
+          </w:p>
+          <w:p>
+            <w:pPr>
+              <w:spacing w:after="50" w:before="0"/>
+            </w:pPr>
+            <w:r>
+              <w:rPr>
+                <w:rFonts w:ascii="Calibri" w:cs="Calibri" w:eastAsia="Calibri" w:hAnsi="Calibri"/>
+                <w:color w:val="000000"/>
+                <w:sz w:val="21"/>
+                <w:szCs w:val="21"/>
+              </w:rPr>
+              <w:t xml:space="preserve">Gemeinsam vergleichen (mündlich): Was ist gleich, was ist anders? → Regelmäßige Verben behalten den Stamm und bekommen -te; unregelmäßige ändern den Stamm (werfen → warf) und bekommen kein -te. Die Personalendungen danach (-st, -en, -t) sind bei beiden gleich.</w:t>
+            </w:r>
+          </w:p>
+          <w:p>
+            <w:pPr>
+              <w:spacing w:after="50" w:before="0"/>
+            </w:pPr>
+            <w:r>
+              <w:rPr>
+                <w:rFonts w:ascii="Calibri" w:cs="Calibri" w:eastAsia="Calibri" w:hAnsi="Calibri"/>
+                <w:color w:val="000000"/>
+                <w:sz w:val="21"/>
+                <w:szCs w:val="21"/>
+              </w:rPr>
+              <w:t xml:space="preserve">Die Merkzeile unter der Tabelle mit abschreiben lassen.</w:t>
+            </w:r>
+          </w:p>
+          <w:tbl>
+            <w:tblPr>
+              <w:tblW w:type="dxa" w:w="8166"/>
+              <w:tblBorders>
+                <w:top w:val="single" w:color="auto" w:sz="4"/>
+                <w:left w:val="single" w:color="auto" w:sz="4"/>
+                <w:bottom w:val="single" w:color="auto" w:sz="4"/>
+                <w:right w:val="single" w:color="auto" w:sz="4"/>
+                <w:insideH w:val="single" w:color="auto" w:sz="4"/>
+                <w:insideV w:val="single" w:color="auto" w:sz="4"/>
+              </w:tblBorders>
+            </w:tblPr>
+            <w:tblGrid>
+              <w:gridCol w:w="8166"/>
+            </w:tblGrid>
+            <w:tr>
+              <w:trPr>
+                <w:cantSplit/>
+              </w:trPr>
+              <w:tc>
+                <w:tcPr>
+                  <w:tcW w:type="dxa" w:w="8166"/>
+                  <w:tcBorders>
+                    <w:top w:val="single" w:color="3D4A3F" w:sz="12"/>
+                    <w:left w:val="single" w:color="3D4A3F" w:sz="12"/>
+                    <w:bottom w:val="single" w:color="3D4A3F" w:sz="12"/>
+                    <w:right w:val="single" w:color="3D4A3F" w:sz="12"/>
+                  </w:tcBorders>
+                  <w:shd w:fill="3D4A3F" w:color="auto" w:val="clear"/>
+                  <w:tcMar>
+                    <w:top w:type="dxa" w:w="30"/>
+                    <w:left w:type="dxa" w:w="100"/>
+                    <w:bottom w:type="dxa" w:w="30"/>
+                    <w:right w:type="dxa" w:w="100"/>
+                  </w:tcMar>
+                  <w:vAlign w:val="center"/>
+                </w:tcPr>
+                <w:p>
+                  <w:pPr>
+                    <w:spacing w:after="0" w:before="0"/>
+                  </w:pPr>
+                  <w:r>
+                    <w:rPr>
+                      <w:rFonts w:ascii="Calibri" w:cs="Calibri" w:eastAsia="Calibri" w:hAnsi="Calibri"/>
+                      <w:b/>
+                      <w:bCs/>
+                      <w:color w:val="FFFFFF"/>
+                      <w:sz w:val="16"/>
+                      <w:szCs w:val="16"/>
+                    </w:rPr>
+                    <w:t xml:space="preserve">TAFEL · Mitte · Präteritum konjugieren</w:t>
+                  </w:r>
+                </w:p>
+              </w:tc>
+            </w:tr>
+            <w:tr>
+              <w:trPr>
+                <w:cantSplit/>
+              </w:trPr>
+              <w:tc>
+                <w:tcPr>
+                  <w:tcW w:type="dxa" w:w="8166"/>
+                  <w:tcBorders>
+                    <w:top w:val="single" w:color="3D4A3F" w:sz="12"/>
+                    <w:left w:val="single" w:color="3D4A3F" w:sz="12"/>
+                    <w:bottom w:val="single" w:color="3D4A3F" w:sz="12"/>
+                    <w:right w:val="single" w:color="3D4A3F" w:sz="12"/>
+                  </w:tcBorders>
+                  <w:shd w:fill="F3F6F1" w:color="auto" w:val="clear"/>
+                  <w:tcMar>
+                    <w:top w:type="dxa" w:w="100"/>
+                    <w:left w:type="dxa" w:w="160"/>
+                    <w:bottom w:type="dxa" w:w="100"/>
+                    <w:right w:type="dxa" w:w="100"/>
+                  </w:tcMar>
+                  <w:vAlign w:val="center"/>
+                </w:tcPr>
+                <w:tbl>
+                  <w:tblPr>
+                    <w:tblW w:type="dxa" w:w="6300"/>
+                    <w:tblBorders>
+                      <w:top w:val="single" w:color="auto" w:sz="4"/>
+                      <w:left w:val="single" w:color="auto" w:sz="4"/>
+                      <w:bottom w:val="single" w:color="auto" w:sz="4"/>
+                      <w:right w:val="single" w:color="auto" w:sz="4"/>
+                      <w:insideH w:val="single" w:color="auto" w:sz="4"/>
+                      <w:insideV w:val="single" w:color="auto" w:sz="4"/>
+                    </w:tblBorders>
+                  </w:tblPr>
+                  <w:tblGrid>
+                    <w:gridCol w:w="1500"/>
+                    <w:gridCol w:w="2400"/>
+                    <w:gridCol w:w="2400"/>
+                  </w:tblGrid>
+                  <w:tr>
+                    <w:trPr>
+                      <w:cantSplit/>
+                    </w:trPr>
+                    <w:tc>
+                      <w:tcPr>
+                        <w:tcW w:type="dxa" w:w="1500"/>
+                        <w:tcBorders>
+                          <w:top w:val="single" w:color="9AA59C" w:sz="4"/>
+                          <w:left w:val="single" w:color="9AA59C" w:sz="4"/>
+                          <w:bottom w:val="single" w:color="9AA59C" w:sz="4"/>
+                          <w:right w:val="single" w:color="9AA59C" w:sz="4"/>
+                        </w:tcBorders>
+                        <w:tcMar>
+                          <w:top w:type="dxa" w:w="60"/>
+                          <w:left w:type="dxa" w:w="100"/>
+                          <w:bottom w:type="dxa" w:w="60"/>
+                          <w:right w:type="dxa" w:w="100"/>
+                        </w:tcMar>
+                        <w:vAlign w:val="center"/>
+                      </w:tcPr>
+                      <w:p>
+                        <w:pPr>
+                          <w:spacing w:after="0" w:before="0"/>
+                        </w:pPr>
+                        <w:r>
+                          <w:rPr>
+                            <w:rFonts w:ascii="Cambria" w:cs="Cambria" w:eastAsia="Cambria" w:hAnsi="Cambria"/>
+                            <w:color w:val="000000"/>
+                            <w:sz w:val="22"/>
+                            <w:szCs w:val="22"/>
+                          </w:rPr>
+                          <w:t xml:space="preserve"/>
+                        </w:r>
+                      </w:p>
+                    </w:tc>
+                    <w:tc>
+                      <w:tcPr>
+                        <w:tcW w:type="dxa" w:w="2400"/>
+                        <w:tcBorders>
+                          <w:top w:val="single" w:color="9AA59C" w:sz="4"/>
+                          <w:left w:val="single" w:color="9AA59C" w:sz="4"/>
+                          <w:bottom w:val="single" w:color="9AA59C" w:sz="4"/>
+                          <w:right w:val="single" w:color="9AA59C" w:sz="4"/>
+                        </w:tcBorders>
+                        <w:tcMar>
+                          <w:top w:type="dxa" w:w="60"/>
+                          <w:left w:type="dxa" w:w="100"/>
+                          <w:bottom w:type="dxa" w:w="60"/>
+                          <w:right w:type="dxa" w:w="100"/>
+                        </w:tcMar>
+                        <w:vAlign w:val="center"/>
+                      </w:tcPr>
+                      <w:p>
+                        <w:pPr>
+                          <w:spacing w:after="0" w:before="0"/>
+                          <w:jc w:val="center"/>
+                        </w:pPr>
+                        <w:r>
+                          <w:rPr>
+                            <w:rFonts w:ascii="Cambria" w:cs="Cambria" w:eastAsia="Cambria" w:hAnsi="Cambria"/>
+                            <w:b/>
+                            <w:bCs/>
+                            <w:color w:val="000000"/>
+                            <w:sz w:val="22"/>
+                            <w:szCs w:val="22"/>
+                          </w:rPr>
+                          <w:t xml:space="preserve">kämpfen</w:t>
+                        </w:r>
+                        <w:r>
+                          <w:rPr>
+                            <w:rFonts w:ascii="Calibri" w:cs="Calibri" w:eastAsia="Calibri" w:hAnsi="Calibri"/>
+                            <w:i/>
+                            <w:iCs/>
+                            <w:color w:val="5B6B8C"/>
+                            <w:sz w:val="16"/>
+                            <w:szCs w:val="16"/>
+                          </w:rPr>
+                          <w:t xml:space="preserve">  regelmäßig</w:t>
+                        </w:r>
+                      </w:p>
+                    </w:tc>
+                    <w:tc>
+                      <w:tcPr>
+                        <w:tcW w:type="dxa" w:w="2400"/>
+                        <w:tcBorders>
+                          <w:top w:val="single" w:color="9AA59C" w:sz="4"/>
+                          <w:left w:val="single" w:color="9AA59C" w:sz="4"/>
+                          <w:bottom w:val="single" w:color="9AA59C" w:sz="4"/>
+                          <w:right w:val="single" w:color="9AA59C" w:sz="4"/>
+                        </w:tcBorders>
+                        <w:tcMar>
+                          <w:top w:type="dxa" w:w="60"/>
+                          <w:left w:type="dxa" w:w="100"/>
+                          <w:bottom w:type="dxa" w:w="60"/>
+                          <w:right w:type="dxa" w:w="100"/>
+                        </w:tcMar>
+                        <w:vAlign w:val="center"/>
+                      </w:tcPr>
+                      <w:p>
+                        <w:pPr>
+                          <w:spacing w:after="0" w:before="0"/>
+                          <w:jc w:val="center"/>
+                        </w:pPr>
+                        <w:r>
+                          <w:rPr>
+                            <w:rFonts w:ascii="Cambria" w:cs="Cambria" w:eastAsia="Cambria" w:hAnsi="Cambria"/>
+                            <w:b/>
+                            <w:bCs/>
+                            <w:color w:val="000000"/>
+                            <w:sz w:val="22"/>
+                            <w:szCs w:val="22"/>
+                          </w:rPr>
+                          <w:t xml:space="preserve">werfen</w:t>
+                        </w:r>
+                        <w:r>
+                          <w:rPr>
+                            <w:rFonts w:ascii="Calibri" w:cs="Calibri" w:eastAsia="Calibri" w:hAnsi="Calibri"/>
+                            <w:i/>
+                            <w:iCs/>
+                            <w:color w:val="5B6B8C"/>
+                            <w:sz w:val="16"/>
+                            <w:szCs w:val="16"/>
+                          </w:rPr>
+                          <w:t xml:space="preserve">  unregelmäßig</w:t>
+                        </w:r>
+                      </w:p>
+                    </w:tc>
+                  </w:tr>
+                  <w:tr>
+                    <w:trPr>
+                      <w:cantSplit/>
+                    </w:trPr>
+                    <w:tc>
+                      <w:tcPr>
+                        <w:tcW w:type="dxa" w:w="1500"/>
+                        <w:tcBorders>
+                          <w:top w:val="single" w:color="9AA59C" w:sz="4"/>
+                          <w:left w:val="single" w:color="9AA59C" w:sz="4"/>
+                          <w:bottom w:val="single" w:color="9AA59C" w:sz="4"/>
+                          <w:right w:val="single" w:color="9AA59C" w:sz="4"/>
+                        </w:tcBorders>
+                        <w:tcMar>
+                          <w:top w:type="dxa" w:w="15"/>
+                          <w:left w:type="dxa" w:w="100"/>
+                          <w:bottom w:type="dxa" w:w="15"/>
+                          <w:right w:type="dxa" w:w="100"/>
+                        </w:tcMar>
+                        <w:vAlign w:val="center"/>
+                      </w:tcPr>
+                      <w:p>
+                        <w:pPr>
+                          <w:spacing w:after="0" w:before="0"/>
+                        </w:pPr>
+                        <w:r>
+                          <w:rPr>
+                            <w:rFonts w:ascii="Cambria" w:cs="Cambria" w:eastAsia="Cambria" w:hAnsi="Cambria"/>
+                            <w:color w:val="5B6B8C"/>
+                            <w:sz w:val="22"/>
+                            <w:szCs w:val="22"/>
+                          </w:rPr>
+                          <w:t xml:space="preserve">ich</w:t>
+                        </w:r>
+                      </w:p>
+                    </w:tc>
+                    <w:tc>
+                      <w:tcPr>
+                        <w:tcW w:type="dxa" w:w="2400"/>
+                        <w:tcBorders>
+                          <w:top w:val="single" w:color="9AA59C" w:sz="4"/>
+                          <w:left w:val="single" w:color="9AA59C" w:sz="4"/>
+                          <w:bottom w:val="single" w:color="9AA59C" w:sz="4"/>
+                          <w:right w:val="single" w:color="9AA59C" w:sz="4"/>
+                        </w:tcBorders>
+                        <w:tcMar>
+                          <w:top w:type="dxa" w:w="15"/>
+                          <w:left w:type="dxa" w:w="100"/>
+                          <w:bottom w:type="dxa" w:w="15"/>
+                          <w:right w:type="dxa" w:w="100"/>
+                        </w:tcMar>
+                        <w:vAlign w:val="center"/>
+                      </w:tcPr>
+                      <w:p>
+                        <w:pPr>
+                          <w:spacing w:after="0" w:before="0"/>
+                          <w:jc w:val="center"/>
+                        </w:pPr>
+                        <w:r>
+                          <w:rPr>
+                            <w:rFonts w:ascii="Cambria" w:cs="Cambria" w:eastAsia="Cambria" w:hAnsi="Cambria"/>
+                            <w:color w:val="000000"/>
+                            <w:sz w:val="21"/>
+                            <w:szCs w:val="21"/>
+                          </w:rPr>
+                          <w:t xml:space="preserve">kämpf</w:t>
+                        </w:r>
+                        <w:r>
+                          <w:rPr>
+                            <w:rFonts w:ascii="Cambria" w:cs="Cambria" w:eastAsia="Cambria" w:hAnsi="Cambria"/>
+                            <w:b/>
+                            <w:bCs/>
+                            <w:color w:val="1E2761"/>
+                            <w:sz w:val="21"/>
+                            <w:szCs w:val="21"/>
+                            <w:u w:val="single"/>
+                          </w:rPr>
+                          <w:t xml:space="preserve">te</w:t>
+                        </w:r>
+                      </w:p>
+                    </w:tc>
+                    <w:tc>
+                      <w:tcPr>
+                        <w:tcW w:type="dxa" w:w="2400"/>
+                        <w:tcBorders>
+                          <w:top w:val="single" w:color="9AA59C" w:sz="4"/>
+                          <w:left w:val="single" w:color="9AA59C" w:sz="4"/>
+                          <w:bottom w:val="single" w:color="9AA59C" w:sz="4"/>
+                          <w:right w:val="single" w:color="9AA59C" w:sz="4"/>
+                        </w:tcBorders>
+                        <w:tcMar>
+                          <w:top w:type="dxa" w:w="15"/>
+                          <w:left w:type="dxa" w:w="100"/>
+                          <w:bottom w:type="dxa" w:w="15"/>
+                          <w:right w:type="dxa" w:w="100"/>
+                        </w:tcMar>
+                        <w:vAlign w:val="center"/>
+                      </w:tcPr>
+                      <w:p>
+                        <w:pPr>
+                          <w:spacing w:after="0" w:before="0"/>
+                          <w:jc w:val="center"/>
+                        </w:pPr>
+                        <w:r>
+                          <w:rPr>
+                            <w:rFonts w:ascii="Cambria" w:cs="Cambria" w:eastAsia="Cambria" w:hAnsi="Cambria"/>
+                            <w:color w:val="000000"/>
+                            <w:sz w:val="21"/>
+                            <w:szCs w:val="21"/>
+                          </w:rPr>
+                          <w:t xml:space="preserve">warf</w:t>
+                        </w:r>
+                        <w:r>
+                          <w:rPr>
+                            <w:rFonts w:ascii="Calibri" w:cs="Calibri" w:eastAsia="Calibri" w:hAnsi="Calibri"/>
+                            <w:color w:val="5B6B8C"/>
+                            <w:sz w:val="18"/>
+                            <w:szCs w:val="18"/>
+                          </w:rPr>
+                          <w:t xml:space="preserve">  –</w:t>
+                        </w:r>
+                      </w:p>
+                    </w:tc>
+                  </w:tr>
+                  <w:tr>
+                    <w:trPr>
+                      <w:cantSplit/>
+                    </w:trPr>
+                    <w:tc>
+                      <w:tcPr>
+                        <w:tcW w:type="dxa" w:w="1500"/>
+                        <w:tcBorders>
+                          <w:top w:val="single" w:color="9AA59C" w:sz="4"/>
+                          <w:left w:val="single" w:color="9AA59C" w:sz="4"/>
+                          <w:bottom w:val="single" w:color="9AA59C" w:sz="4"/>
+                          <w:right w:val="single" w:color="9AA59C" w:sz="4"/>
+                        </w:tcBorders>
+                        <w:tcMar>
+                          <w:top w:type="dxa" w:w="15"/>
+                          <w:left w:type="dxa" w:w="100"/>
+                          <w:bottom w:type="dxa" w:w="15"/>
+                          <w:right w:type="dxa" w:w="100"/>
+                        </w:tcMar>
+                        <w:vAlign w:val="center"/>
+                      </w:tcPr>
+                      <w:p>
+                        <w:pPr>
+                          <w:spacing w:after="0" w:before="0"/>
+                        </w:pPr>
+                        <w:r>
+                          <w:rPr>
+                            <w:rFonts w:ascii="Cambria" w:cs="Cambria" w:eastAsia="Cambria" w:hAnsi="Cambria"/>
+                            <w:color w:val="5B6B8C"/>
+                            <w:sz w:val="22"/>
+                            <w:szCs w:val="22"/>
+                          </w:rPr>
+                          <w:t xml:space="preserve">du</w:t>
+                        </w:r>
+                      </w:p>
+                    </w:tc>
+                    <w:tc>
+                      <w:tcPr>
+                        <w:tcW w:type="dxa" w:w="2400"/>
+                        <w:tcBorders>
+                          <w:top w:val="single" w:color="9AA59C" w:sz="4"/>
+                          <w:left w:val="single" w:color="9AA59C" w:sz="4"/>
+                          <w:bottom w:val="single" w:color="9AA59C" w:sz="4"/>
+                          <w:right w:val="single" w:color="9AA59C" w:sz="4"/>
+                        </w:tcBorders>
+                        <w:tcMar>
+                          <w:top w:type="dxa" w:w="15"/>
+                          <w:left w:type="dxa" w:w="100"/>
+                          <w:bottom w:type="dxa" w:w="15"/>
+                          <w:right w:type="dxa" w:w="100"/>
+                        </w:tcMar>
+                        <w:vAlign w:val="center"/>
+                      </w:tcPr>
+                      <w:p>
+                        <w:pPr>
+                          <w:spacing w:after="0" w:before="0"/>
+                          <w:jc w:val="center"/>
+                        </w:pPr>
+                        <w:r>
+                          <w:rPr>
+                            <w:rFonts w:ascii="Cambria" w:cs="Cambria" w:eastAsia="Cambria" w:hAnsi="Cambria"/>
+                            <w:color w:val="000000"/>
+                            <w:sz w:val="21"/>
+                            <w:szCs w:val="21"/>
+                          </w:rPr>
+                          <w:t xml:space="preserve">kämpf</w:t>
+                        </w:r>
+                        <w:r>
+                          <w:rPr>
+                            <w:rFonts w:ascii="Cambria" w:cs="Cambria" w:eastAsia="Cambria" w:hAnsi="Cambria"/>
+                            <w:b/>
+                            <w:bCs/>
+                            <w:color w:val="1E2761"/>
+                            <w:sz w:val="21"/>
+                            <w:szCs w:val="21"/>
+                            <w:u w:val="single"/>
+                          </w:rPr>
+                          <w:t xml:space="preserve">test</w:t>
+                        </w:r>
+                      </w:p>
+                    </w:tc>
+                    <w:tc>
+                      <w:tcPr>
+                        <w:tcW w:type="dxa" w:w="2400"/>
+                        <w:tcBorders>
+                          <w:top w:val="single" w:color="9AA59C" w:sz="4"/>
+                          <w:left w:val="single" w:color="9AA59C" w:sz="4"/>
+                          <w:bottom w:val="single" w:color="9AA59C" w:sz="4"/>
+                          <w:right w:val="single" w:color="9AA59C" w:sz="4"/>
+                        </w:tcBorders>
+                        <w:tcMar>
+                          <w:top w:type="dxa" w:w="15"/>
+                          <w:left w:type="dxa" w:w="100"/>
+                          <w:bottom w:type="dxa" w:w="15"/>
+                          <w:right w:type="dxa" w:w="100"/>
+                        </w:tcMar>
+                        <w:vAlign w:val="center"/>
+                      </w:tcPr>
+                      <w:p>
+                        <w:pPr>
+                          <w:spacing w:after="0" w:before="0"/>
+                          <w:jc w:val="center"/>
+                        </w:pPr>
+                        <w:r>
+                          <w:rPr>
+                            <w:rFonts w:ascii="Cambria" w:cs="Cambria" w:eastAsia="Cambria" w:hAnsi="Cambria"/>
+                            <w:color w:val="000000"/>
+                            <w:sz w:val="21"/>
+                            <w:szCs w:val="21"/>
+                          </w:rPr>
+                          <w:t xml:space="preserve">warf</w:t>
+                        </w:r>
+                        <w:r>
+                          <w:rPr>
+                            <w:rFonts w:ascii="Cambria" w:cs="Cambria" w:eastAsia="Cambria" w:hAnsi="Cambria"/>
+                            <w:b/>
+                            <w:bCs/>
+                            <w:color w:val="1E2761"/>
+                            <w:sz w:val="21"/>
+                            <w:szCs w:val="21"/>
+                            <w:u w:val="single"/>
+                          </w:rPr>
+                          <w:t xml:space="preserve">st</w:t>
+                        </w:r>
+                      </w:p>
+                    </w:tc>
+                  </w:tr>
+                  <w:tr>
+                    <w:trPr>
+                      <w:cantSplit/>
+                    </w:trPr>
+                    <w:tc>
+                      <w:tcPr>
+                        <w:tcW w:type="dxa" w:w="1500"/>
+                        <w:tcBorders>
+                          <w:top w:val="single" w:color="9AA59C" w:sz="4"/>
+                          <w:left w:val="single" w:color="9AA59C" w:sz="4"/>
+                          <w:bottom w:val="single" w:color="9AA59C" w:sz="4"/>
+                          <w:right w:val="single" w:color="9AA59C" w:sz="4"/>
+                        </w:tcBorders>
+                        <w:tcMar>
+                          <w:top w:type="dxa" w:w="15"/>
+                          <w:left w:type="dxa" w:w="100"/>
+                          <w:bottom w:type="dxa" w:w="15"/>
+                          <w:right w:type="dxa" w:w="100"/>
+                        </w:tcMar>
+                        <w:vAlign w:val="center"/>
+                      </w:tcPr>
+                      <w:p>
+                        <w:pPr>
+                          <w:spacing w:after="0" w:before="0"/>
+                        </w:pPr>
+                        <w:r>
+                          <w:rPr>
+                            <w:rFonts w:ascii="Cambria" w:cs="Cambria" w:eastAsia="Cambria" w:hAnsi="Cambria"/>
+                            <w:color w:val="5B6B8C"/>
+                            <w:sz w:val="22"/>
+                            <w:szCs w:val="22"/>
+                          </w:rPr>
+                          <w:t xml:space="preserve">er/sie/es</w:t>
+                        </w:r>
+                      </w:p>
+                    </w:tc>
+                    <w:tc>
+                      <w:tcPr>
+                        <w:tcW w:type="dxa" w:w="2400"/>
+                        <w:tcBorders>
+                          <w:top w:val="single" w:color="9AA59C" w:sz="4"/>
+                          <w:left w:val="single" w:color="9AA59C" w:sz="4"/>
+                          <w:bottom w:val="single" w:color="9AA59C" w:sz="4"/>
+                          <w:right w:val="single" w:color="9AA59C" w:sz="4"/>
+                        </w:tcBorders>
+                        <w:tcMar>
+                          <w:top w:type="dxa" w:w="15"/>
+                          <w:left w:type="dxa" w:w="100"/>
+                          <w:bottom w:type="dxa" w:w="15"/>
+                          <w:right w:type="dxa" w:w="100"/>
+                        </w:tcMar>
+                        <w:vAlign w:val="center"/>
+                      </w:tcPr>
+                      <w:p>
+                        <w:pPr>
+                          <w:spacing w:after="0" w:before="0"/>
+                          <w:jc w:val="center"/>
+                        </w:pPr>
+                        <w:r>
+                          <w:rPr>
+                            <w:rFonts w:ascii="Cambria" w:cs="Cambria" w:eastAsia="Cambria" w:hAnsi="Cambria"/>
+                            <w:color w:val="000000"/>
+                            <w:sz w:val="21"/>
+                            <w:szCs w:val="21"/>
+                          </w:rPr>
+                          <w:t xml:space="preserve">kämpf</w:t>
+                        </w:r>
+                        <w:r>
+                          <w:rPr>
+                            <w:rFonts w:ascii="Cambria" w:cs="Cambria" w:eastAsia="Cambria" w:hAnsi="Cambria"/>
+                            <w:b/>
+                            <w:bCs/>
+                            <w:color w:val="1E2761"/>
+                            <w:sz w:val="21"/>
+                            <w:szCs w:val="21"/>
+                            <w:u w:val="single"/>
+                          </w:rPr>
+                          <w:t xml:space="preserve">te</w:t>
+                        </w:r>
+                      </w:p>
+                    </w:tc>
+                    <w:tc>
+                      <w:tcPr>
+                        <w:tcW w:type="dxa" w:w="2400"/>
+                        <w:tcBorders>
+                          <w:top w:val="single" w:color="9AA59C" w:sz="4"/>
+                          <w:left w:val="single" w:color="9AA59C" w:sz="4"/>
+                          <w:bottom w:val="single" w:color="9AA59C" w:sz="4"/>
+                          <w:right w:val="single" w:color="9AA59C" w:sz="4"/>
+                        </w:tcBorders>
+                        <w:tcMar>
+                          <w:top w:type="dxa" w:w="15"/>
+                          <w:left w:type="dxa" w:w="100"/>
+                          <w:bottom w:type="dxa" w:w="15"/>
+                          <w:right w:type="dxa" w:w="100"/>
+                        </w:tcMar>
+                        <w:vAlign w:val="center"/>
+                      </w:tcPr>
+                      <w:p>
+                        <w:pPr>
+                          <w:spacing w:after="0" w:before="0"/>
+                          <w:jc w:val="center"/>
+                        </w:pPr>
+                        <w:r>
+                          <w:rPr>
+                            <w:rFonts w:ascii="Cambria" w:cs="Cambria" w:eastAsia="Cambria" w:hAnsi="Cambria"/>
+                            <w:color w:val="000000"/>
+                            <w:sz w:val="21"/>
+                            <w:szCs w:val="21"/>
+                          </w:rPr>
+                          <w:t xml:space="preserve">warf</w:t>
+                        </w:r>
+                        <w:r>
+                          <w:rPr>
+                            <w:rFonts w:ascii="Calibri" w:cs="Calibri" w:eastAsia="Calibri" w:hAnsi="Calibri"/>
+                            <w:color w:val="5B6B8C"/>
+                            <w:sz w:val="18"/>
+                            <w:szCs w:val="18"/>
+                          </w:rPr>
+                          <w:t xml:space="preserve">  –</w:t>
+                        </w:r>
+                      </w:p>
+                    </w:tc>
+                  </w:tr>
+                  <w:tr>
+                    <w:trPr>
+                      <w:cantSplit/>
+                    </w:trPr>
+                    <w:tc>
+                      <w:tcPr>
+                        <w:tcW w:type="dxa" w:w="1500"/>
+                        <w:tcBorders>
+                          <w:top w:val="single" w:color="9AA59C" w:sz="4"/>
+                          <w:left w:val="single" w:color="9AA59C" w:sz="4"/>
+                          <w:bottom w:val="single" w:color="9AA59C" w:sz="4"/>
+                          <w:right w:val="single" w:color="9AA59C" w:sz="4"/>
+                        </w:tcBorders>
+                        <w:tcMar>
+                          <w:top w:type="dxa" w:w="15"/>
+                          <w:left w:type="dxa" w:w="100"/>
+                          <w:bottom w:type="dxa" w:w="15"/>
+                          <w:right w:type="dxa" w:w="100"/>
+                        </w:tcMar>
+                        <w:vAlign w:val="center"/>
+                      </w:tcPr>
+                      <w:p>
+                        <w:pPr>
+                          <w:spacing w:after="0" w:before="0"/>
+                        </w:pPr>
+                        <w:r>
+                          <w:rPr>
+                            <w:rFonts w:ascii="Cambria" w:cs="Cambria" w:eastAsia="Cambria" w:hAnsi="Cambria"/>
+                            <w:color w:val="5B6B8C"/>
+                            <w:sz w:val="22"/>
+                            <w:szCs w:val="22"/>
+                          </w:rPr>
+                          <w:t xml:space="preserve">wir</w:t>
+                        </w:r>
+                      </w:p>
+                    </w:tc>
+                    <w:tc>
+                      <w:tcPr>
+                        <w:tcW w:type="dxa" w:w="2400"/>
+                        <w:tcBorders>
+                          <w:top w:val="single" w:color="9AA59C" w:sz="4"/>
+                          <w:left w:val="single" w:color="9AA59C" w:sz="4"/>
+                          <w:bottom w:val="single" w:color="9AA59C" w:sz="4"/>
+                          <w:right w:val="single" w:color="9AA59C" w:sz="4"/>
+                        </w:tcBorders>
+                        <w:tcMar>
+                          <w:top w:type="dxa" w:w="15"/>
+                          <w:left w:type="dxa" w:w="100"/>
+                          <w:bottom w:type="dxa" w:w="15"/>
+                          <w:right w:type="dxa" w:w="100"/>
+                        </w:tcMar>
+                        <w:vAlign w:val="center"/>
+                      </w:tcPr>
+                      <w:p>
+                        <w:pPr>
+                          <w:spacing w:after="0" w:before="0"/>
+                          <w:jc w:val="center"/>
+                        </w:pPr>
+                        <w:r>
+                          <w:rPr>
+                            <w:rFonts w:ascii="Cambria" w:cs="Cambria" w:eastAsia="Cambria" w:hAnsi="Cambria"/>
+                            <w:color w:val="000000"/>
+                            <w:sz w:val="21"/>
+                            <w:szCs w:val="21"/>
+                          </w:rPr>
+                          <w:t xml:space="preserve">kämpf</w:t>
+                        </w:r>
+                        <w:r>
+                          <w:rPr>
+                            <w:rFonts w:ascii="Cambria" w:cs="Cambria" w:eastAsia="Cambria" w:hAnsi="Cambria"/>
+                            <w:b/>
+                            <w:bCs/>
+                            <w:color w:val="1E2761"/>
+                            <w:sz w:val="21"/>
+                            <w:szCs w:val="21"/>
+                            <w:u w:val="single"/>
+                          </w:rPr>
+                          <w:t xml:space="preserve">ten</w:t>
+                        </w:r>
+                      </w:p>
+                    </w:tc>
+                    <w:tc>
+                      <w:tcPr>
+                        <w:tcW w:type="dxa" w:w="2400"/>
+                        <w:tcBorders>
+                          <w:top w:val="single" w:color="9AA59C" w:sz="4"/>
+                          <w:left w:val="single" w:color="9AA59C" w:sz="4"/>
+                          <w:bottom w:val="single" w:color="9AA59C" w:sz="4"/>
+                          <w:right w:val="single" w:color="9AA59C" w:sz="4"/>
+                        </w:tcBorders>
+                        <w:tcMar>
+                          <w:top w:type="dxa" w:w="15"/>
+                          <w:left w:type="dxa" w:w="100"/>
+                          <w:bottom w:type="dxa" w:w="15"/>
+                          <w:right w:type="dxa" w:w="100"/>
+                        </w:tcMar>
+                        <w:vAlign w:val="center"/>
+                      </w:tcPr>
+                      <w:p>
+                        <w:pPr>
+                          <w:spacing w:after="0" w:before="0"/>
+                          <w:jc w:val="center"/>
+                        </w:pPr>
+                        <w:r>
+                          <w:rPr>
+                            <w:rFonts w:ascii="Cambria" w:cs="Cambria" w:eastAsia="Cambria" w:hAnsi="Cambria"/>
+                            <w:color w:val="000000"/>
+                            <w:sz w:val="21"/>
+                            <w:szCs w:val="21"/>
+                          </w:rPr>
+                          <w:t xml:space="preserve">warf</w:t>
+                        </w:r>
+                        <w:r>
+                          <w:rPr>
+                            <w:rFonts w:ascii="Cambria" w:cs="Cambria" w:eastAsia="Cambria" w:hAnsi="Cambria"/>
+                            <w:b/>
+                            <w:bCs/>
+                            <w:color w:val="1E2761"/>
+                            <w:sz w:val="21"/>
+                            <w:szCs w:val="21"/>
+                            <w:u w:val="single"/>
+                          </w:rPr>
+                          <w:t xml:space="preserve">en</w:t>
+                        </w:r>
+                      </w:p>
+                    </w:tc>
+                  </w:tr>
+                  <w:tr>
+                    <w:trPr>
+                      <w:cantSplit/>
+                    </w:trPr>
+                    <w:tc>
+                      <w:tcPr>
+                        <w:tcW w:type="dxa" w:w="1500"/>
+                        <w:tcBorders>
+                          <w:top w:val="single" w:color="9AA59C" w:sz="4"/>
+                          <w:left w:val="single" w:color="9AA59C" w:sz="4"/>
+                          <w:bottom w:val="single" w:color="9AA59C" w:sz="4"/>
+                          <w:right w:val="single" w:color="9AA59C" w:sz="4"/>
+                        </w:tcBorders>
+                        <w:tcMar>
+                          <w:top w:type="dxa" w:w="15"/>
+                          <w:left w:type="dxa" w:w="100"/>
+                          <w:bottom w:type="dxa" w:w="15"/>
+                          <w:right w:type="dxa" w:w="100"/>
+                        </w:tcMar>
+                        <w:vAlign w:val="center"/>
+                      </w:tcPr>
+                      <w:p>
+                        <w:pPr>
+                          <w:spacing w:after="0" w:before="0"/>
+                        </w:pPr>
+                        <w:r>
+                          <w:rPr>
+                            <w:rFonts w:ascii="Cambria" w:cs="Cambria" w:eastAsia="Cambria" w:hAnsi="Cambria"/>
+                            <w:color w:val="5B6B8C"/>
+                            <w:sz w:val="22"/>
+                            <w:szCs w:val="22"/>
+                          </w:rPr>
+                          <w:t xml:space="preserve">ihr</w:t>
+                        </w:r>
+                      </w:p>
+                    </w:tc>
+                    <w:tc>
+                      <w:tcPr>
+                        <w:tcW w:type="dxa" w:w="2400"/>
+                        <w:tcBorders>
+                          <w:top w:val="single" w:color="9AA59C" w:sz="4"/>
+                          <w:left w:val="single" w:color="9AA59C" w:sz="4"/>
+                          <w:bottom w:val="single" w:color="9AA59C" w:sz="4"/>
+                          <w:right w:val="single" w:color="9AA59C" w:sz="4"/>
+                        </w:tcBorders>
+                        <w:tcMar>
+                          <w:top w:type="dxa" w:w="15"/>
+                          <w:left w:type="dxa" w:w="100"/>
+                          <w:bottom w:type="dxa" w:w="15"/>
+                          <w:right w:type="dxa" w:w="100"/>
+                        </w:tcMar>
+                        <w:vAlign w:val="center"/>
+                      </w:tcPr>
+                      <w:p>
+                        <w:pPr>
+                          <w:spacing w:after="0" w:before="0"/>
+                          <w:jc w:val="center"/>
+                        </w:pPr>
+                        <w:r>
+                          <w:rPr>
+                            <w:rFonts w:ascii="Cambria" w:cs="Cambria" w:eastAsia="Cambria" w:hAnsi="Cambria"/>
+                            <w:color w:val="000000"/>
+                            <w:sz w:val="21"/>
+                            <w:szCs w:val="21"/>
+                          </w:rPr>
+                          <w:t xml:space="preserve">kämpf</w:t>
+                        </w:r>
+                        <w:r>
+                          <w:rPr>
+                            <w:rFonts w:ascii="Cambria" w:cs="Cambria" w:eastAsia="Cambria" w:hAnsi="Cambria"/>
+                            <w:b/>
+                            <w:bCs/>
+                            <w:color w:val="1E2761"/>
+                            <w:sz w:val="21"/>
+                            <w:szCs w:val="21"/>
+                            <w:u w:val="single"/>
+                          </w:rPr>
+                          <w:t xml:space="preserve">tet</w:t>
+                        </w:r>
+                      </w:p>
+                    </w:tc>
+                    <w:tc>
+                      <w:tcPr>
+                        <w:tcW w:type="dxa" w:w="2400"/>
+                        <w:tcBorders>
+                          <w:top w:val="single" w:color="9AA59C" w:sz="4"/>
+                          <w:left w:val="single" w:color="9AA59C" w:sz="4"/>
+                          <w:bottom w:val="single" w:color="9AA59C" w:sz="4"/>
+                          <w:right w:val="single" w:color="9AA59C" w:sz="4"/>
+                        </w:tcBorders>
+                        <w:tcMar>
+                          <w:top w:type="dxa" w:w="15"/>
+                          <w:left w:type="dxa" w:w="100"/>
+                          <w:bottom w:type="dxa" w:w="15"/>
+                          <w:right w:type="dxa" w:w="100"/>
+                        </w:tcMar>
+                        <w:vAlign w:val="center"/>
+                      </w:tcPr>
+                      <w:p>
+                        <w:pPr>
+                          <w:spacing w:after="0" w:before="0"/>
+                          <w:jc w:val="center"/>
+                        </w:pPr>
+                        <w:r>
+                          <w:rPr>
+                            <w:rFonts w:ascii="Cambria" w:cs="Cambria" w:eastAsia="Cambria" w:hAnsi="Cambria"/>
+                            <w:color w:val="000000"/>
+                            <w:sz w:val="21"/>
+                            <w:szCs w:val="21"/>
+                          </w:rPr>
+                          <w:t xml:space="preserve">warf</w:t>
+                        </w:r>
+                        <w:r>
+                          <w:rPr>
+                            <w:rFonts w:ascii="Cambria" w:cs="Cambria" w:eastAsia="Cambria" w:hAnsi="Cambria"/>
+                            <w:b/>
+                            <w:bCs/>
+                            <w:color w:val="1E2761"/>
+                            <w:sz w:val="21"/>
+                            <w:szCs w:val="21"/>
+                            <w:u w:val="single"/>
+                          </w:rPr>
+                          <w:t xml:space="preserve">t</w:t>
+                        </w:r>
+                      </w:p>
+                    </w:tc>
+                  </w:tr>
+                  <w:tr>
+                    <w:trPr>
+                      <w:cantSplit/>
+                    </w:trPr>
+                    <w:tc>
+                      <w:tcPr>
+                        <w:tcW w:type="dxa" w:w="1500"/>
+                        <w:tcBorders>
+                          <w:top w:val="single" w:color="9AA59C" w:sz="4"/>
+                          <w:left w:val="single" w:color="9AA59C" w:sz="4"/>
+                          <w:bottom w:val="single" w:color="9AA59C" w:sz="4"/>
+                          <w:right w:val="single" w:color="9AA59C" w:sz="4"/>
+                        </w:tcBorders>
+                        <w:tcMar>
+                          <w:top w:type="dxa" w:w="15"/>
+                          <w:left w:type="dxa" w:w="100"/>
+                          <w:bottom w:type="dxa" w:w="15"/>
+                          <w:right w:type="dxa" w:w="100"/>
+                        </w:tcMar>
+                        <w:vAlign w:val="center"/>
+                      </w:tcPr>
+                      <w:p>
+                        <w:pPr>
+                          <w:spacing w:after="0" w:before="0"/>
+                        </w:pPr>
+                        <w:r>
+                          <w:rPr>
+                            <w:rFonts w:ascii="Cambria" w:cs="Cambria" w:eastAsia="Cambria" w:hAnsi="Cambria"/>
+                            <w:color w:val="5B6B8C"/>
+                            <w:sz w:val="22"/>
+                            <w:szCs w:val="22"/>
+                          </w:rPr>
+                          <w:t xml:space="preserve">sie/Sie</w:t>
+                        </w:r>
+                      </w:p>
+                    </w:tc>
+                    <w:tc>
+                      <w:tcPr>
+                        <w:tcW w:type="dxa" w:w="2400"/>
+                        <w:tcBorders>
+                          <w:top w:val="single" w:color="9AA59C" w:sz="4"/>
+                          <w:left w:val="single" w:color="9AA59C" w:sz="4"/>
+                          <w:bottom w:val="single" w:color="9AA59C" w:sz="4"/>
+                          <w:right w:val="single" w:color="9AA59C" w:sz="4"/>
+                        </w:tcBorders>
+                        <w:tcMar>
+                          <w:top w:type="dxa" w:w="15"/>
+                          <w:left w:type="dxa" w:w="100"/>
+                          <w:bottom w:type="dxa" w:w="15"/>
+                          <w:right w:type="dxa" w:w="100"/>
+                        </w:tcMar>
+                        <w:vAlign w:val="center"/>
+                      </w:tcPr>
+                      <w:p>
+                        <w:pPr>
+                          <w:spacing w:after="0" w:before="0"/>
+                          <w:jc w:val="center"/>
+                        </w:pPr>
+                        <w:r>
+                          <w:rPr>
+                            <w:rFonts w:ascii="Cambria" w:cs="Cambria" w:eastAsia="Cambria" w:hAnsi="Cambria"/>
+                            <w:color w:val="000000"/>
+                            <w:sz w:val="21"/>
+                            <w:szCs w:val="21"/>
+                          </w:rPr>
+                          <w:t xml:space="preserve">kämpf</w:t>
+                        </w:r>
+                        <w:r>
+                          <w:rPr>
+                            <w:rFonts w:ascii="Cambria" w:cs="Cambria" w:eastAsia="Cambria" w:hAnsi="Cambria"/>
+                            <w:b/>
+                            <w:bCs/>
+                            <w:color w:val="1E2761"/>
+                            <w:sz w:val="21"/>
+                            <w:szCs w:val="21"/>
+                            <w:u w:val="single"/>
+                          </w:rPr>
+                          <w:t xml:space="preserve">ten</w:t>
+                        </w:r>
+                      </w:p>
+                    </w:tc>
+                    <w:tc>
+                      <w:tcPr>
+                        <w:tcW w:type="dxa" w:w="2400"/>
+                        <w:tcBorders>
+                          <w:top w:val="single" w:color="9AA59C" w:sz="4"/>
+                          <w:left w:val="single" w:color="9AA59C" w:sz="4"/>
+                          <w:bottom w:val="single" w:color="9AA59C" w:sz="4"/>
+                          <w:right w:val="single" w:color="9AA59C" w:sz="4"/>
+                        </w:tcBorders>
+                        <w:tcMar>
+                          <w:top w:type="dxa" w:w="15"/>
+                          <w:left w:type="dxa" w:w="100"/>
+                          <w:bottom w:type="dxa" w:w="15"/>
+                          <w:right w:type="dxa" w:w="100"/>
+                        </w:tcMar>
+                        <w:vAlign w:val="center"/>
+                      </w:tcPr>
+                      <w:p>
+                        <w:pPr>
+                          <w:spacing w:after="0" w:before="0"/>
+                          <w:jc w:val="center"/>
+                        </w:pPr>
+                        <w:r>
+                          <w:rPr>
+                            <w:rFonts w:ascii="Cambria" w:cs="Cambria" w:eastAsia="Cambria" w:hAnsi="Cambria"/>
+                            <w:color w:val="000000"/>
+                            <w:sz w:val="21"/>
+                            <w:szCs w:val="21"/>
+                          </w:rPr>
+                          <w:t xml:space="preserve">warf</w:t>
+                        </w:r>
+                        <w:r>
+                          <w:rPr>
+                            <w:rFonts w:ascii="Cambria" w:cs="Cambria" w:eastAsia="Cambria" w:hAnsi="Cambria"/>
+                            <w:b/>
+                            <w:bCs/>
+                            <w:color w:val="1E2761"/>
+                            <w:sz w:val="21"/>
+                            <w:szCs w:val="21"/>
+                            <w:u w:val="single"/>
+                          </w:rPr>
+                          <w:t xml:space="preserve">en</w:t>
+                        </w:r>
+                      </w:p>
+                    </w:tc>
+                  </w:tr>
+                </w:tbl>
+                <w:p>
+                  <w:pPr>
+                    <w:spacing w:after="40" w:before="0"/>
+                  </w:pPr>
+                  <w:r>
+                    <w:rPr>
+                      <w:rFonts w:ascii="Calibri" w:cs="Calibri" w:eastAsia="Calibri" w:hAnsi="Calibri"/>
+                      <w:color w:val="000000"/>
+                      <w:sz w:val="22"/>
+                      <w:szCs w:val="22"/>
+                    </w:rPr>
+                    <w:t xml:space="preserve"/>
+                  </w:r>
+                </w:p>
+                <w:p>
+                  <w:pPr>
+                    <w:spacing w:after="0" w:before="0"/>
+                  </w:pPr>
+                  <w:r>
+                    <w:rPr>
+                      <w:rFonts w:ascii="Calibri" w:cs="Calibri" w:eastAsia="Calibri" w:hAnsi="Calibri"/>
+                      <w:b/>
+                      <w:bCs/>
+                      <w:color w:val="000000"/>
+                      <w:sz w:val="21"/>
+                      <w:szCs w:val="21"/>
+                    </w:rPr>
+                    <w:t xml:space="preserve">regelmäßig: </w:t>
+                  </w:r>
+                  <w:r>
+                    <w:rPr>
+                      <w:rFonts w:ascii="Calibri" w:cs="Calibri" w:eastAsia="Calibri" w:hAnsi="Calibri"/>
+                      <w:color w:val="000000"/>
+                      <w:sz w:val="21"/>
+                      <w:szCs w:val="21"/>
+                    </w:rPr>
+                    <w:t xml:space="preserve">Stamm bleibt + </w:t>
+                  </w:r>
+                  <w:r>
+                    <w:rPr>
+                      <w:rFonts w:ascii="Calibri" w:cs="Calibri" w:eastAsia="Calibri" w:hAnsi="Calibri"/>
+                      <w:b/>
+                      <w:bCs/>
+                      <w:color w:val="000000"/>
+                      <w:sz w:val="21"/>
+                      <w:szCs w:val="21"/>
+                    </w:rPr>
+                    <w:t xml:space="preserve">-te</w:t>
+                  </w:r>
+                  <w:r>
+                    <w:rPr>
+                      <w:rFonts w:ascii="Calibri" w:cs="Calibri" w:eastAsia="Calibri" w:hAnsi="Calibri"/>
+                      <w:color w:val="000000"/>
+                      <w:sz w:val="21"/>
+                      <w:szCs w:val="21"/>
+                    </w:rPr>
+                    <w:t xml:space="preserve"> + Endung   ·   </w:t>
+                  </w:r>
+                  <w:r>
+                    <w:rPr>
+                      <w:rFonts w:ascii="Calibri" w:cs="Calibri" w:eastAsia="Calibri" w:hAnsi="Calibri"/>
+                      <w:b/>
+                      <w:bCs/>
+                      <w:color w:val="000000"/>
+                      <w:sz w:val="21"/>
+                      <w:szCs w:val="21"/>
+                    </w:rPr>
+                    <w:t xml:space="preserve">unregelmäßig: </w:t>
+                  </w:r>
+                  <w:r>
+                    <w:rPr>
+                      <w:rFonts w:ascii="Calibri" w:cs="Calibri" w:eastAsia="Calibri" w:hAnsi="Calibri"/>
+                      <w:color w:val="000000"/>
+                      <w:sz w:val="21"/>
+                      <w:szCs w:val="21"/>
+                    </w:rPr>
+                    <w:t xml:space="preserve">neuer Stamm + Endung   ·   </w:t>
+                  </w:r>
+                  <w:r>
+                    <w:rPr>
+                      <w:rFonts w:ascii="Calibri" w:cs="Calibri" w:eastAsia="Calibri" w:hAnsi="Calibri"/>
+                      <w:b/>
+                      <w:bCs/>
+                      <w:color w:val="000000"/>
+                      <w:sz w:val="21"/>
+                      <w:szCs w:val="21"/>
+                    </w:rPr>
+                    <w:t xml:space="preserve">ich und er/sie/es: keine Personalendung</w:t>
+                  </w:r>
+                </w:p>
+              </w:tc>
+            </w:tr>
+          </w:tbl>
+          <w:p>
+            <w:pPr>
+              <w:spacing w:after="20" w:before="0"/>
+            </w:pPr>
+            <w:r>
+              <w:rPr>
+                <w:rFonts w:ascii="Calibri" w:cs="Calibri" w:eastAsia="Calibri" w:hAnsi="Calibri"/>
+                <w:color w:val="000000"/>
+                <w:sz w:val="22"/>
+                <w:szCs w:val="22"/>
+              </w:rPr>
+              <w:t xml:space="preserve"/>
+            </w:r>
+          </w:p>
+          <w:p>
+            <w:pPr>
+              <w:spacing w:after="0" w:before="0"/>
+            </w:pPr>
+            <w:r>
+              <w:rPr>
+                <w:rFonts w:ascii="Calibri" w:cs="Calibri" w:eastAsia="Calibri" w:hAnsi="Calibri"/>
+                <w:b/>
+                <w:bCs/>
+                <w:color w:val="5B6B8C"/>
+                <w:sz w:val="19"/>
+                <w:szCs w:val="19"/>
+              </w:rPr>
+              <w:t xml:space="preserve">Lösung: </w:t>
+            </w:r>
+            <w:r>
+              <w:rPr>
+                <w:rFonts w:ascii="Calibri" w:cs="Calibri" w:eastAsia="Calibri" w:hAnsi="Calibri"/>
+                <w:color w:val="5B6B8C"/>
+                <w:sz w:val="19"/>
+                <w:szCs w:val="19"/>
+              </w:rPr>
+              <w:t xml:space="preserve">kämpfte · kämpftest · kämpfte · kämpften · kämpftet · kämpften | warf · warfst · warf · warfen · warft · warfen</w:t>
+            </w:r>
+          </w:p>
+        </w:tc>
+      </w:tr>
+    </w:tbl>
+    <w:p>
+      <w:pPr>
+        <w:spacing w:after="40" w:before="0"/>
+      </w:pPr>
+      <w:r>
+        <w:rPr>
+          <w:rFonts w:ascii="Calibri" w:cs="Calibri" w:eastAsia="Calibri" w:hAnsi="Calibri"/>
+          <w:color w:val="000000"/>
+          <w:sz w:val="22"/>
+          <w:szCs w:val="22"/>
+        </w:rPr>
+        <w:t xml:space="preserve"/>
+      </w:r>
+    </w:p>
+    <w:p>
+      <w:pPr>
+        <w:keepNext/>
+        <w:spacing w:after="100" w:before="200"/>
+      </w:pPr>
+      <w:r>
+        <w:rPr>
+          <w:rFonts w:ascii="Cambria" w:cs="Cambria" w:eastAsia="Cambria" w:hAnsi="Cambria"/>
+          <w:b/>
+          <w:bCs/>
+          <w:color w:val="D9534F"/>
+          <w:sz w:val="28"/>
+          <w:szCs w:val="28"/>
+        </w:rPr>
+        <w:t xml:space="preserve">2  </w:t>
+      </w:r>
+      <w:r>
+        <w:rPr>
+          <w:rFonts w:ascii="Cambria" w:cs="Cambria" w:eastAsia="Cambria" w:hAnsi="Cambria"/>
+          <w:b/>
+          <w:bCs/>
+          <w:color w:val="1E2761"/>
+          <w:sz w:val="28"/>
+          <w:szCs w:val="28"/>
+        </w:rPr>
         <w:t xml:space="preserve">Ü9a Präteritum der Sportverben</w:t>
       </w:r>
       <w:r>
@@ -1757,7 +3275,7 @@
           <w:sz w:val="20"/>
           <w:szCs w:val="20"/>
         </w:rPr>
-        <w:t xml:space="preserve">   10 Min.</w:t>
+        <w:t xml:space="preserve">   8 Min.</w:t>
       </w:r>
     </w:p>
     <w:tbl>
@@ -2340,7 +3858,7 @@
           <w:sz w:val="28"/>
           <w:szCs w:val="28"/>
         </w:rPr>
-        <w:t xml:space="preserve">2  </w:t>
+        <w:t xml:space="preserve">3  </w:t>
       </w:r>
       <w:r>
         <w:rPr>
@@ -2362,7 +3880,7 @@
           <w:sz w:val="20"/>
           <w:szCs w:val="20"/>
         </w:rPr>
-        <w:t xml:space="preserve">   10 Min.</w:t>
+        <w:t xml:space="preserve">   8 Min.</w:t>
       </w:r>
     </w:p>
     <w:tbl>
@@ -2933,7 +4451,7 @@
           <w:sz w:val="28"/>
           <w:szCs w:val="28"/>
         </w:rPr>
-        <w:t xml:space="preserve">3  </w:t>
+        <w:t xml:space="preserve">4  </w:t>
       </w:r>
       <w:r>
         <w:rPr>
@@ -5046,7 +6564,7 @@
           <w:sz w:val="28"/>
           <w:szCs w:val="28"/>
         </w:rPr>
-        <w:t xml:space="preserve">4  </w:t>
+        <w:t xml:space="preserve">5  </w:t>
       </w:r>
       <w:r>
         <w:rPr>
@@ -5639,7 +7157,7 @@
           <w:sz w:val="28"/>
           <w:szCs w:val="28"/>
         </w:rPr>
-        <w:t xml:space="preserve">5  </w:t>
+        <w:t xml:space="preserve">6  </w:t>
       </w:r>
       <w:r>
         <w:rPr>

</xml_diff>